<commit_message>
docs: add Savara Lettuce Farm interview notes, site photos, and split locale slide
</commit_message>
<xml_diff>
--- a/Chapter 1 v2.docx
+++ b/Chapter 1 v2.docx
@@ -22585,6 +22585,33 @@
           <w:rtl w:val="0"/>
         </w:rPr>
         <w:t xml:space="preserve">After the interview questionnaire is finalized, it will be submitted to the thesis adviser for suggestions and approval. A letter of request will be prepared, and the required approvals from the appropriate school authorities and the farm owners will be secured. The primary mode of data collection will be face-to-face interviews conducted by the researchers, which allow direct interaction and the clarification of responses when needed. Each interview takes about 15 minutes.</w:t>
+      </w:r>
+    </w:p>
+    <w:p>
+      <w:pPr>
+        <w:spacing w:after="120" w:line="480" w:lineRule="auto"/>
+        <w:ind w:firstLine="720"/>
+        <w:jc w:val="both"/>
+        <w:rPr>
+          <w:rFonts w:ascii="Cambria" w:cs="Cambria" w:eastAsia="Cambria" w:hAnsi="Cambria"/>
+          <w:i w:val="0"/>
+          <w:iCs w:val="0"/>
+          <w:color w:val="1f1f1f"/>
+          <w:sz w:val="22"/>
+          <w:szCs w:val="22"/>
+        </w:rPr>
+      </w:pPr>
+      <w:r>
+        <w:rPr>
+          <w:rFonts w:ascii="Cambria" w:cs="Cambria" w:eastAsia="Cambria" w:hAnsi="Cambria"/>
+          <w:i w:val="0"/>
+          <w:iCs w:val="0"/>
+          <w:color w:val="1f1f1f"/>
+          <w:sz w:val="22"/>
+          <w:szCs w:val="22"/>
+          <w:rtl w:val="0"/>
+        </w:rPr>
+        <w:t>A preliminary interview with the owner of Savara Lettuce Farm was conducted on October 11, 2026, using the interview questionnaire and with the respondent's informed consent. Its results will be included in the needs analysis in Phase 1.</w:t>
       </w:r>
     </w:p>
     <w:p>

</xml_diff>